<commit_message>
cambios excel y docx
</commit_message>
<xml_diff>
--- a/Docs/Observaciones-Lab6.docx
+++ b/Docs/Observaciones-Lab6.docx
@@ -1,6 +1,6 @@
 
 <file path=word/document.xml><?xml version="1.0" encoding="utf-8"?>
-<w:document xmlns:wpc="http://schemas.microsoft.com/office/word/2010/wordprocessingCanvas" xmlns:cx="http://schemas.microsoft.com/office/drawing/2014/chartex" xmlns:cx1="http://schemas.microsoft.com/office/drawing/2015/9/8/chartex" xmlns:cx2="http://schemas.microsoft.com/office/drawing/2015/10/21/chartex" xmlns:cx3="http://schemas.microsoft.com/office/drawing/2016/5/9/chartex" xmlns:cx4="http://schemas.microsoft.com/office/drawing/2016/5/10/chartex" xmlns:cx5="http://schemas.microsoft.com/office/drawing/2016/5/11/chartex" xmlns:cx6="http://schemas.microsoft.com/office/drawing/2016/5/12/chartex" xmlns:cx7="http://schemas.microsoft.com/office/drawing/2016/5/13/chartex" xmlns:cx8="http://schemas.microsoft.com/office/drawing/2016/5/14/chartex" xmlns:mc="http://schemas.openxmlformats.org/markup-compatibility/2006" xmlns:aink="http://schemas.microsoft.com/office/drawing/2016/ink" xmlns:am3d="http://schemas.microsoft.com/office/drawing/2017/model3d" xmlns:o="urn:schemas-microsoft-com:office:office" xmlns:oel="http://schemas.microsoft.com/office/2019/extlst" xmlns:r="http://schemas.openxmlformats.org/officeDocument/2006/relationships" xmlns:m="http://schemas.openxmlformats.org/officeDocument/2006/math" xmlns:v="urn:schemas-microsoft-com:vml" xmlns:wp14="http://schemas.microsoft.com/office/word/2010/wordprocessingDrawing" xmlns:wp="http://schemas.openxmlformats.org/drawingml/2006/wordprocessingDrawing" xmlns:w10="urn:schemas-microsoft-com:office:word" xmlns:w="http://schemas.openxmlformats.org/wordprocessingml/2006/main" xmlns:w14="http://schemas.microsoft.com/office/word/2010/wordml" xmlns:w15="http://schemas.microsoft.com/office/word/2012/wordml" xmlns:w16cex="http://schemas.microsoft.com/office/word/2018/wordml/cex" xmlns:w16cid="http://schemas.microsoft.com/office/word/2016/wordml/cid" xmlns:w16="http://schemas.microsoft.com/office/word/2018/wordml" xmlns:w16du="http://schemas.microsoft.com/office/word/2023/wordml/word16du" xmlns:w16sdtdh="http://schemas.microsoft.com/office/word/2020/wordml/sdtdatahash" xmlns:w16sdtfl="http://schemas.microsoft.com/office/word/2024/wordml/sdtformatlock" xmlns:w16se="http://schemas.microsoft.com/office/word/2015/wordml/symex" xmlns:wpg="http://schemas.microsoft.com/office/word/2010/wordprocessingGroup" xmlns:wpi="http://schemas.microsoft.com/office/word/2010/wordprocessingInk" xmlns:wne="http://schemas.microsoft.com/office/word/2006/wordml" xmlns:wps="http://schemas.microsoft.com/office/word/2010/wordprocessingShape" mc:Ignorable="w14 w15 w16se w16cid w16 w16cex w16sdtdh w16sdtfl w16du wp14">
+<w:document xmlns:wpc="http://schemas.microsoft.com/office/word/2010/wordprocessingCanvas" xmlns:cx="http://schemas.microsoft.com/office/drawing/2014/chartex" xmlns:cx1="http://schemas.microsoft.com/office/drawing/2015/9/8/chartex" xmlns:cx2="http://schemas.microsoft.com/office/drawing/2015/10/21/chartex" xmlns:cx3="http://schemas.microsoft.com/office/drawing/2016/5/9/chartex" xmlns:cx4="http://schemas.microsoft.com/office/drawing/2016/5/10/chartex" xmlns:cx5="http://schemas.microsoft.com/office/drawing/2016/5/11/chartex" xmlns:cx6="http://schemas.microsoft.com/office/drawing/2016/5/12/chartex" xmlns:cx7="http://schemas.microsoft.com/office/drawing/2016/5/13/chartex" xmlns:cx8="http://schemas.microsoft.com/office/drawing/2016/5/14/chartex" xmlns:mc="http://schemas.openxmlformats.org/markup-compatibility/2006" xmlns:aink="http://schemas.microsoft.com/office/drawing/2016/ink" xmlns:am3d="http://schemas.microsoft.com/office/drawing/2017/model3d" xmlns:o="urn:schemas-microsoft-com:office:office" xmlns:r="http://schemas.openxmlformats.org/officeDocument/2006/relationships" xmlns:m="http://schemas.openxmlformats.org/officeDocument/2006/math" xmlns:v="urn:schemas-microsoft-com:vml" xmlns:wp14="http://schemas.microsoft.com/office/word/2010/wordprocessingDrawing" xmlns:wp="http://schemas.openxmlformats.org/drawingml/2006/wordprocessingDrawing" xmlns:w10="urn:schemas-microsoft-com:office:word" xmlns:w="http://schemas.openxmlformats.org/wordprocessingml/2006/main" xmlns:w14="http://schemas.microsoft.com/office/word/2010/wordml" xmlns:w15="http://schemas.microsoft.com/office/word/2012/wordml" xmlns:w16cex="http://schemas.microsoft.com/office/word/2018/wordml/cex" xmlns:w16cid="http://schemas.microsoft.com/office/word/2016/wordml/cid" xmlns:w16="http://schemas.microsoft.com/office/word/2018/wordml" xmlns:w16sdtdh="http://schemas.microsoft.com/office/word/2020/wordml/sdtdatahash" xmlns:w16se="http://schemas.microsoft.com/office/word/2015/wordml/symex" xmlns:wpg="http://schemas.microsoft.com/office/word/2010/wordprocessingGroup" xmlns:wpi="http://schemas.microsoft.com/office/word/2010/wordprocessingInk" xmlns:wne="http://schemas.microsoft.com/office/word/2006/wordml" xmlns:wps="http://schemas.microsoft.com/office/word/2010/wordprocessingShape" mc:Ignorable="w14 w15 w16se w16cid w16 w16cex w16sdtdh wp14">
   <w:body>
     <w:p>
       <w:pPr>
@@ -55,14 +55,28 @@
           <w:noProof w:val="0"/>
           <w:lang w:val="es-CO"/>
         </w:rPr>
-        <w:t xml:space="preserve">Estudiante </w:t>
+        <w:t xml:space="preserve">Juan Andrés Ospina </w:t>
       </w:r>
       <w:r>
         <w:rPr>
           <w:noProof w:val="0"/>
           <w:lang w:val="es-CO"/>
         </w:rPr>
-        <w:t>1 Cod XXXX</w:t>
+        <w:t>Ramíre</w:t>
+      </w:r>
+      <w:r>
+        <w:rPr>
+          <w:noProof w:val="0"/>
+          <w:lang w:val="es-CO"/>
+        </w:rPr>
+        <w:t>z</w:t>
+      </w:r>
+      <w:r>
+        <w:rPr>
+          <w:noProof w:val="0"/>
+          <w:lang w:val="es-CO"/>
+        </w:rPr>
+        <w:t xml:space="preserve"> 202614830</w:t>
       </w:r>
     </w:p>
     <w:p>
@@ -79,7 +93,7 @@
           <w:noProof w:val="0"/>
           <w:lang w:val="es-CO"/>
         </w:rPr>
-        <w:t>Estudiante 2 Cod XXXX</w:t>
+        <w:t>Jose Alexander Santos Cobos 202613656</w:t>
       </w:r>
     </w:p>
     <w:p>
@@ -96,32 +110,8 @@
           <w:noProof w:val="0"/>
           <w:lang w:val="es-CO"/>
         </w:rPr>
-        <w:t xml:space="preserve">Estudiante </w:t>
-      </w:r>
-      <w:r>
-        <w:rPr>
-          <w:noProof w:val="0"/>
-          <w:lang w:val="es-CO"/>
-        </w:rPr>
-        <w:t>3</w:t>
-      </w:r>
-      <w:r>
-        <w:rPr>
-          <w:noProof w:val="0"/>
-          <w:lang w:val="es-CO"/>
-        </w:rPr>
-        <w:t xml:space="preserve"> Cod XXXX</w:t>
-      </w:r>
-    </w:p>
-    <w:p>
-      <w:pPr>
-        <w:spacing w:after="0"/>
-        <w:jc w:val="right"/>
-        <w:rPr>
-          <w:noProof w:val="0"/>
-          <w:lang w:val="es-CO"/>
-        </w:rPr>
-      </w:pPr>
+        <w:t>Juan Esteban Lesmes Chaves 202614029</w:t>
+      </w:r>
     </w:p>
     <w:tbl>
       <w:tblPr>
@@ -224,6 +214,13 @@
                 <w:lang w:val="es-419"/>
               </w:rPr>
             </w:pPr>
+            <w:r>
+              <w:rPr>
+                <w:rFonts w:ascii="Dax-Regular" w:hAnsi="Dax-Regular"/>
+                <w:lang w:val="es-419"/>
+              </w:rPr>
+              <w:t>Intel(R) Core(TM) Ultra 5 235U</w:t>
+            </w:r>
           </w:p>
         </w:tc>
       </w:tr>
@@ -266,6 +263,13 @@
                 <w:lang w:val="es-419"/>
               </w:rPr>
             </w:pPr>
+            <w:r>
+              <w:rPr>
+                <w:rFonts w:ascii="Dax-Regular" w:hAnsi="Dax-Regular"/>
+                <w:lang w:val="es-419"/>
+              </w:rPr>
+              <w:t>16</w:t>
+            </w:r>
           </w:p>
         </w:tc>
       </w:tr>
@@ -309,6 +313,13 @@
                 <w:lang w:val="es-419"/>
               </w:rPr>
             </w:pPr>
+            <w:r>
+              <w:rPr>
+                <w:rFonts w:ascii="Dax-Regular" w:hAnsi="Dax-Regular"/>
+                <w:lang w:val="es-419"/>
+              </w:rPr>
+              <w:t>Windows 11 Pro</w:t>
+            </w:r>
           </w:p>
         </w:tc>
       </w:tr>
@@ -652,6 +663,13 @@
                 <w:lang w:val="es-419"/>
               </w:rPr>
             </w:pPr>
+            <w:r>
+              <w:rPr>
+                <w:rFonts w:ascii="Calibri" w:hAnsi="Calibri" w:cs="Calibri"/>
+                <w:color w:val="000000"/>
+              </w:rPr>
+              <w:t>687028,46</w:t>
+            </w:r>
           </w:p>
         </w:tc>
         <w:tc>
@@ -677,6 +695,13 @@
                 <w:lang w:val="es-419"/>
               </w:rPr>
             </w:pPr>
+            <w:r>
+              <w:rPr>
+                <w:rFonts w:ascii="Calibri" w:hAnsi="Calibri" w:cs="Calibri"/>
+                <w:color w:val="000000"/>
+              </w:rPr>
+              <w:t>6967,07</w:t>
+            </w:r>
           </w:p>
         </w:tc>
       </w:tr>
@@ -737,6 +762,13 @@
                 <w:lang w:val="es-419"/>
               </w:rPr>
             </w:pPr>
+            <w:r>
+              <w:rPr>
+                <w:rFonts w:ascii="Calibri" w:hAnsi="Calibri" w:cs="Calibri"/>
+                <w:color w:val="000000"/>
+              </w:rPr>
+              <w:t>420006,18</w:t>
+            </w:r>
           </w:p>
         </w:tc>
         <w:tc>
@@ -761,6 +793,13 @@
                 <w:lang w:val="es-419"/>
               </w:rPr>
             </w:pPr>
+            <w:r>
+              <w:rPr>
+                <w:rFonts w:ascii="Calibri" w:hAnsi="Calibri" w:cs="Calibri"/>
+                <w:color w:val="000000"/>
+              </w:rPr>
+              <w:t>5240,10</w:t>
+            </w:r>
           </w:p>
         </w:tc>
       </w:tr>
@@ -821,6 +860,13 @@
                 <w:lang w:val="es-419"/>
               </w:rPr>
             </w:pPr>
+            <w:r>
+              <w:rPr>
+                <w:rFonts w:ascii="Calibri" w:hAnsi="Calibri" w:cs="Calibri"/>
+                <w:color w:val="000000"/>
+              </w:rPr>
+              <w:t>404024,26</w:t>
+            </w:r>
           </w:p>
         </w:tc>
         <w:tc>
@@ -845,6 +891,13 @@
                 <w:lang w:val="es-419"/>
               </w:rPr>
             </w:pPr>
+            <w:r>
+              <w:rPr>
+                <w:rFonts w:ascii="Calibri" w:hAnsi="Calibri" w:cs="Calibri"/>
+                <w:color w:val="000000"/>
+              </w:rPr>
+              <w:t>5595,38</w:t>
+            </w:r>
           </w:p>
         </w:tc>
       </w:tr>
@@ -905,6 +958,13 @@
                 <w:lang w:val="es-419"/>
               </w:rPr>
             </w:pPr>
+            <w:r>
+              <w:rPr>
+                <w:rFonts w:ascii="Calibri" w:hAnsi="Calibri" w:cs="Calibri"/>
+                <w:color w:val="000000"/>
+              </w:rPr>
+              <w:t>390973,61</w:t>
+            </w:r>
           </w:p>
         </w:tc>
         <w:tc>
@@ -929,6 +989,13 @@
                 <w:lang w:val="es-419"/>
               </w:rPr>
             </w:pPr>
+            <w:r>
+              <w:rPr>
+                <w:rFonts w:ascii="Calibri" w:hAnsi="Calibri" w:cs="Calibri"/>
+                <w:color w:val="000000"/>
+              </w:rPr>
+              <w:t>5012,67</w:t>
+            </w:r>
           </w:p>
         </w:tc>
       </w:tr>
@@ -1277,6 +1344,13 @@
                 <w:lang w:val="es-419"/>
               </w:rPr>
             </w:pPr>
+            <w:r>
+              <w:rPr>
+                <w:rFonts w:ascii="Calibri" w:hAnsi="Calibri" w:cs="Calibri"/>
+                <w:color w:val="000000"/>
+              </w:rPr>
+              <w:t>405776,23</w:t>
+            </w:r>
           </w:p>
         </w:tc>
         <w:tc>
@@ -1301,6 +1375,13 @@
                 <w:lang w:val="es-419"/>
               </w:rPr>
             </w:pPr>
+            <w:r>
+              <w:rPr>
+                <w:rFonts w:ascii="Calibri" w:hAnsi="Calibri" w:cs="Calibri"/>
+                <w:color w:val="000000"/>
+              </w:rPr>
+              <w:t>4822,94</w:t>
+            </w:r>
           </w:p>
         </w:tc>
       </w:tr>
@@ -1361,6 +1442,13 @@
                 <w:lang w:val="es-419"/>
               </w:rPr>
             </w:pPr>
+            <w:r>
+              <w:rPr>
+                <w:rFonts w:ascii="Calibri" w:hAnsi="Calibri" w:cs="Calibri"/>
+                <w:color w:val="000000"/>
+              </w:rPr>
+              <w:t>397646,18</w:t>
+            </w:r>
           </w:p>
         </w:tc>
         <w:tc>
@@ -1384,6 +1472,13 @@
                 <w:lang w:val="es-419"/>
               </w:rPr>
             </w:pPr>
+            <w:r>
+              <w:rPr>
+                <w:rFonts w:ascii="Calibri" w:hAnsi="Calibri" w:cs="Calibri"/>
+                <w:color w:val="000000"/>
+              </w:rPr>
+              <w:t>4571,15</w:t>
+            </w:r>
           </w:p>
         </w:tc>
       </w:tr>
@@ -1446,6 +1541,13 @@
                 <w:lang w:val="es-419"/>
               </w:rPr>
             </w:pPr>
+            <w:r>
+              <w:rPr>
+                <w:rFonts w:ascii="Calibri" w:hAnsi="Calibri" w:cs="Calibri"/>
+                <w:color w:val="000000"/>
+              </w:rPr>
+              <w:t>395338,31</w:t>
+            </w:r>
           </w:p>
         </w:tc>
         <w:tc>
@@ -1471,6 +1573,13 @@
                 <w:lang w:val="es-419"/>
               </w:rPr>
             </w:pPr>
+            <w:r>
+              <w:rPr>
+                <w:rFonts w:ascii="Calibri" w:hAnsi="Calibri" w:cs="Calibri"/>
+                <w:color w:val="000000"/>
+              </w:rPr>
+              <w:t>6400,97</w:t>
+            </w:r>
           </w:p>
         </w:tc>
       </w:tr>
@@ -1531,6 +1640,13 @@
                 <w:lang w:val="es-419"/>
               </w:rPr>
             </w:pPr>
+            <w:r>
+              <w:rPr>
+                <w:rFonts w:ascii="Calibri" w:hAnsi="Calibri" w:cs="Calibri"/>
+                <w:color w:val="000000"/>
+              </w:rPr>
+              <w:t>394248,58</w:t>
+            </w:r>
           </w:p>
         </w:tc>
         <w:tc>
@@ -1554,6 +1670,13 @@
                 <w:lang w:val="es-419"/>
               </w:rPr>
             </w:pPr>
+            <w:r>
+              <w:rPr>
+                <w:rFonts w:ascii="Calibri" w:hAnsi="Calibri" w:cs="Calibri"/>
+                <w:color w:val="000000"/>
+              </w:rPr>
+              <w:t>5378,43</w:t>
+            </w:r>
           </w:p>
         </w:tc>
       </w:tr>
@@ -1563,6 +1686,8 @@
         <w:pStyle w:val="Descripcin"/>
         <w:jc w:val="center"/>
         <w:rPr>
+          <w:b/>
+          <w:bCs/>
           <w:lang w:val="es-CO"/>
         </w:rPr>
       </w:pPr>
@@ -1746,6 +1871,7 @@
           <w:rFonts w:ascii="Dax-Regular" w:hAnsi="Dax-Regular"/>
           <w:lang w:val="es-CO"/>
         </w:rPr>
+        <w:lastRenderedPageBreak/>
         <w:t xml:space="preserve">Comparación de memoria y tiempo de ejecución para </w:t>
       </w:r>
       <w:r>
@@ -1782,6 +1908,58 @@
           <w:lang w:val="es-CO"/>
         </w:rPr>
         <w:t>CHAINING</w:t>
+      </w:r>
+      <w:r>
+        <w:rPr>
+          <w:rFonts w:ascii="Dax-Regular" w:hAnsi="Dax-Regular"/>
+          <w:noProof/>
+          <w:lang w:val="es-CO"/>
+        </w:rPr>
+        <w:drawing>
+          <wp:inline distT="0" distB="0" distL="0" distR="0" wp14:anchorId="36A72160" wp14:editId="7058256B">
+            <wp:extent cx="5810885" cy="3366770"/>
+            <wp:effectExtent l="0" t="0" r="0" b="5080"/>
+            <wp:docPr id="2" name="Imagen 2"/>
+            <wp:cNvGraphicFramePr>
+              <a:graphicFrameLocks xmlns:a="http://schemas.openxmlformats.org/drawingml/2006/main" noChangeAspect="1"/>
+            </wp:cNvGraphicFramePr>
+            <a:graphic xmlns:a="http://schemas.openxmlformats.org/drawingml/2006/main">
+              <a:graphicData uri="http://schemas.openxmlformats.org/drawingml/2006/picture">
+                <pic:pic xmlns:pic="http://schemas.openxmlformats.org/drawingml/2006/picture">
+                  <pic:nvPicPr>
+                    <pic:cNvPr id="0" name="Picture 2"/>
+                    <pic:cNvPicPr>
+                      <a:picLocks noChangeAspect="1" noChangeArrowheads="1"/>
+                    </pic:cNvPicPr>
+                  </pic:nvPicPr>
+                  <pic:blipFill>
+                    <a:blip r:embed="rId10" cstate="print">
+                      <a:extLst>
+                        <a:ext uri="{28A0092B-C50C-407E-A947-70E740481C1C}">
+                          <a14:useLocalDpi xmlns:a14="http://schemas.microsoft.com/office/drawing/2010/main" val="0"/>
+                        </a:ext>
+                      </a:extLst>
+                    </a:blip>
+                    <a:srcRect/>
+                    <a:stretch>
+                      <a:fillRect/>
+                    </a:stretch>
+                  </pic:blipFill>
+                  <pic:spPr bwMode="auto">
+                    <a:xfrm>
+                      <a:off x="0" y="0"/>
+                      <a:ext cx="5810885" cy="3366770"/>
+                    </a:xfrm>
+                    <a:prstGeom prst="rect">
+                      <a:avLst/>
+                    </a:prstGeom>
+                    <a:noFill/>
+                  </pic:spPr>
+                </pic:pic>
+              </a:graphicData>
+            </a:graphic>
+          </wp:inline>
+        </w:drawing>
       </w:r>
     </w:p>
     <w:p>
@@ -1858,9 +2036,63 @@
           <w:lang w:val="es-CO"/>
         </w:rPr>
       </w:pPr>
+      <w:r>
+        <w:rPr>
+          <w:rFonts w:ascii="Dax-Regular" w:hAnsi="Dax-Regular"/>
+          <w:noProof/>
+          <w:lang w:val="es-CO"/>
+        </w:rPr>
+        <w:drawing>
+          <wp:inline distT="0" distB="0" distL="0" distR="0" wp14:anchorId="1D8DB268" wp14:editId="6742D5E0">
+            <wp:extent cx="5797550" cy="4154170"/>
+            <wp:effectExtent l="0" t="0" r="0" b="0"/>
+            <wp:docPr id="3" name="Imagen 3"/>
+            <wp:cNvGraphicFramePr>
+              <a:graphicFrameLocks xmlns:a="http://schemas.openxmlformats.org/drawingml/2006/main" noChangeAspect="1"/>
+            </wp:cNvGraphicFramePr>
+            <a:graphic xmlns:a="http://schemas.openxmlformats.org/drawingml/2006/main">
+              <a:graphicData uri="http://schemas.openxmlformats.org/drawingml/2006/picture">
+                <pic:pic xmlns:pic="http://schemas.openxmlformats.org/drawingml/2006/picture">
+                  <pic:nvPicPr>
+                    <pic:cNvPr id="0" name="Picture 3"/>
+                    <pic:cNvPicPr>
+                      <a:picLocks noChangeAspect="1" noChangeArrowheads="1"/>
+                    </pic:cNvPicPr>
+                  </pic:nvPicPr>
+                  <pic:blipFill>
+                    <a:blip r:embed="rId11">
+                      <a:extLst>
+                        <a:ext uri="{28A0092B-C50C-407E-A947-70E740481C1C}">
+                          <a14:useLocalDpi xmlns:a14="http://schemas.microsoft.com/office/drawing/2010/main" val="0"/>
+                        </a:ext>
+                      </a:extLst>
+                    </a:blip>
+                    <a:srcRect/>
+                    <a:stretch>
+                      <a:fillRect/>
+                    </a:stretch>
+                  </pic:blipFill>
+                  <pic:spPr bwMode="auto">
+                    <a:xfrm>
+                      <a:off x="0" y="0"/>
+                      <a:ext cx="5797550" cy="4154170"/>
+                    </a:xfrm>
+                    <a:prstGeom prst="rect">
+                      <a:avLst/>
+                    </a:prstGeom>
+                    <a:noFill/>
+                  </pic:spPr>
+                </pic:pic>
+              </a:graphicData>
+            </a:graphic>
+          </wp:inline>
+        </w:drawing>
+      </w:r>
     </w:p>
     <w:p>
       <w:pPr>
+        <w:spacing w:after="0"/>
+        <w:jc w:val="both"/>
         <w:rPr>
           <w:rFonts w:ascii="Dax-Regular" w:hAnsi="Dax-Regular"/>
           <w:lang w:val="es-CO"/>
@@ -1869,32 +2101,6 @@
     </w:p>
     <w:p>
       <w:pPr>
-        <w:spacing w:after="0"/>
-        <w:jc w:val="both"/>
-        <w:rPr>
-          <w:rFonts w:ascii="Dax-Regular" w:hAnsi="Dax-Regular"/>
-          <w:lang w:val="es-CO"/>
-        </w:rPr>
-      </w:pPr>
-    </w:p>
-    <w:p>
-      <w:pPr>
-        <w:rPr>
-          <w:rFonts w:ascii="Dax-Regular" w:hAnsi="Dax-Regular"/>
-          <w:lang w:val="es-CO"/>
-        </w:rPr>
-      </w:pPr>
-      <w:r>
-        <w:rPr>
-          <w:rFonts w:ascii="Dax-Regular" w:hAnsi="Dax-Regular"/>
-          <w:lang w:val="es-CO"/>
-        </w:rPr>
-        <w:br w:type="page"/>
-      </w:r>
-    </w:p>
-    <w:p>
-      <w:pPr>
-        <w:pStyle w:val="Ttulo1"/>
         <w:rPr>
           <w:b/>
           <w:bCs/>
@@ -1902,6 +2108,13 @@
           <w:lang w:val="es-CO"/>
         </w:rPr>
       </w:pPr>
+      <w:r>
+        <w:rPr>
+          <w:rFonts w:ascii="Dax-Regular" w:hAnsi="Dax-Regular"/>
+          <w:lang w:val="es-CO"/>
+        </w:rPr>
+        <w:br w:type="page"/>
+      </w:r>
       <w:r>
         <w:rPr>
           <w:b/>
@@ -1981,6 +2194,29 @@
         </w:rPr>
         <w:t>?</w:t>
       </w:r>
+    </w:p>
+    <w:p>
+      <w:pPr>
+        <w:ind w:left="360"/>
+        <w:jc w:val="both"/>
+        <w:rPr>
+          <w:lang w:val="es-419"/>
+        </w:rPr>
+      </w:pPr>
+    </w:p>
+    <w:p>
+      <w:pPr>
+        <w:ind w:left="360"/>
+        <w:rPr>
+          <w:lang w:val="es-419"/>
+        </w:rPr>
+      </w:pPr>
+      <w:r>
+        <w:rPr>
+          <w:lang w:val="es-419"/>
+        </w:rPr>
+        <w:t>Porque perf_counter mide el tiempo que pasa en la vida real, process_time cuenta solo el tiempo que el procesador trabaja para el programa sin contar ciertas cosas como las esperas.</w:t>
+      </w:r>
       <w:r>
         <w:rPr>
           <w:lang w:val="es-419"/>
@@ -2051,6 +2287,81 @@
     </w:p>
     <w:p>
       <w:pPr>
+        <w:ind w:left="360"/>
+        <w:jc w:val="both"/>
+        <w:rPr>
+          <w:lang w:val="es-CO"/>
+        </w:rPr>
+      </w:pPr>
+      <w:r>
+        <w:rPr>
+          <w:lang w:val="es-CO"/>
+        </w:rPr>
+        <w:t>start() prende el seguimiento de memoria</w:t>
+      </w:r>
+      <w:r>
+        <w:rPr>
+          <w:lang w:val="es-CO"/>
+        </w:rPr>
+        <w:t xml:space="preserve"> para que</w:t>
+      </w:r>
+      <w:r>
+        <w:rPr>
+          <w:lang w:val="es-CO"/>
+        </w:rPr>
+        <w:t xml:space="preserve"> take_snapshot() </w:t>
+      </w:r>
+      <w:r>
+        <w:rPr>
+          <w:lang w:val="es-CO"/>
+        </w:rPr>
+        <w:t>no tire</w:t>
+      </w:r>
+      <w:r>
+        <w:rPr>
+          <w:lang w:val="es-CO"/>
+        </w:rPr>
+        <w:t xml:space="preserve"> error porque no hay nada registrado. stop() lo apaga </w:t>
+      </w:r>
+      <w:r>
+        <w:rPr>
+          <w:lang w:val="es-CO"/>
+        </w:rPr>
+        <w:t>y evita que</w:t>
+      </w:r>
+      <w:r>
+        <w:rPr>
+          <w:lang w:val="es-CO"/>
+        </w:rPr>
+        <w:t xml:space="preserve"> el programa sig</w:t>
+      </w:r>
+      <w:r>
+        <w:rPr>
+          <w:lang w:val="es-CO"/>
+        </w:rPr>
+        <w:t>a</w:t>
+      </w:r>
+      <w:r>
+        <w:rPr>
+          <w:lang w:val="es-CO"/>
+        </w:rPr>
+        <w:t xml:space="preserve"> lento y la siguiente medición arrastr</w:t>
+      </w:r>
+      <w:r>
+        <w:rPr>
+          <w:lang w:val="es-CO"/>
+        </w:rPr>
+        <w:t>e</w:t>
+      </w:r>
+      <w:r>
+        <w:rPr>
+          <w:lang w:val="es-CO"/>
+        </w:rPr>
+        <w:t xml:space="preserve"> datos de la anterior.</w:t>
+      </w:r>
+    </w:p>
+    <w:p>
+      <w:pPr>
         <w:pStyle w:val="Prrafodelista"/>
         <w:ind w:left="360"/>
         <w:jc w:val="both"/>
@@ -2108,6 +2419,33 @@
     </w:p>
     <w:p>
       <w:pPr>
+        <w:ind w:left="360"/>
+        <w:jc w:val="both"/>
+        <w:rPr>
+          <w:lang w:val="es-CO"/>
+        </w:rPr>
+      </w:pPr>
+      <w:r>
+        <w:rPr>
+          <w:lang w:val="es-CO"/>
+        </w:rPr>
+        <w:t>P</w:t>
+      </w:r>
+      <w:r>
+        <w:rPr>
+          <w:lang w:val="es-CO"/>
+        </w:rPr>
+        <w:t>orque tracemalloc registra las reservas de memoria que hace el programa y esto hace que la ejecución sea más lenta.</w:t>
+      </w:r>
+      <w:r>
+        <w:rPr>
+          <w:lang w:val="es-CO"/>
+        </w:rPr>
+        <w:t xml:space="preserve"> Es decir, el tiempo de ejecución va a aumentar, en nuestro caso nombramos una variable booleana para poder desactivar esta medición al momento de ejecutar las pruebas.</w:t>
+      </w:r>
+    </w:p>
+    <w:p>
+      <w:pPr>
         <w:pStyle w:val="Prrafodelista"/>
         <w:ind w:left="360"/>
         <w:jc w:val="both"/>
@@ -2137,11 +2475,31 @@
     </w:p>
     <w:p>
       <w:pPr>
-        <w:pStyle w:val="Prrafodelista"/>
+        <w:ind w:left="360"/>
         <w:rPr>
           <w:lang w:val="es-419"/>
         </w:rPr>
       </w:pPr>
+      <w:r>
+        <w:rPr>
+          <w:lang w:val="es-419"/>
+        </w:rPr>
+        <w:t>En linear probing debería ser 0,5 o más, ya que en 0,1 la memoria era muy alta. Lo mejor sería tener factor de carga 0,9 pero tiene poca diferencia de 0,5</w:t>
+      </w:r>
+    </w:p>
+    <w:p>
+      <w:pPr>
+        <w:ind w:left="360"/>
+        <w:rPr>
+          <w:lang w:val="es-419"/>
+        </w:rPr>
+      </w:pPr>
+      <w:r>
+        <w:rPr>
+          <w:lang w:val="es-419"/>
+        </w:rPr>
+        <w:t>En separate chaining debería ser 4, aunque la memoria bajó con respecto a 8 tuvo el menor tiempo de ejecución</w:t>
+      </w:r>
     </w:p>
     <w:p>
       <w:pPr>
@@ -2165,6 +2523,72 @@
     <w:p>
       <w:pPr>
         <w:pStyle w:val="Prrafodelista"/>
+        <w:ind w:left="360"/>
+        <w:jc w:val="both"/>
+        <w:rPr>
+          <w:lang w:val="es-419"/>
+        </w:rPr>
+      </w:pPr>
+    </w:p>
+    <w:p>
+      <w:pPr>
+        <w:pStyle w:val="Prrafodelista"/>
+        <w:ind w:left="360"/>
+        <w:jc w:val="both"/>
+        <w:rPr>
+          <w:lang w:val="es-CO"/>
+        </w:rPr>
+      </w:pPr>
+      <w:r>
+        <w:rPr>
+          <w:lang w:val="es-CO"/>
+        </w:rPr>
+        <w:t>Linear p</w:t>
+      </w:r>
+      <w:r>
+        <w:rPr>
+          <w:lang w:val="es-CO"/>
+        </w:rPr>
+        <w:t>robing</w:t>
+      </w:r>
+      <w:r>
+        <w:rPr>
+          <w:lang w:val="es-CO"/>
+        </w:rPr>
+        <w:t xml:space="preserve"> s</w:t>
+      </w:r>
+      <w:r>
+        <w:rPr>
+          <w:lang w:val="es-CO"/>
+        </w:rPr>
+        <w:t>ube de 0,5 a 0,7 y baja a 0,9.</w:t>
+      </w:r>
+      <w:r>
+        <w:rPr>
+          <w:lang w:val="es-CO"/>
+        </w:rPr>
+        <w:t xml:space="preserve"> El 0,1 quedo por encima de estos tres</w:t>
+      </w:r>
+    </w:p>
+    <w:p>
+      <w:pPr>
+        <w:pStyle w:val="Prrafodelista"/>
+        <w:ind w:left="360"/>
+        <w:jc w:val="both"/>
+        <w:rPr>
+          <w:lang w:val="es-CO"/>
+        </w:rPr>
+      </w:pPr>
+      <w:r>
+        <w:rPr>
+          <w:lang w:val="es-CO"/>
+        </w:rPr>
+        <w:t>Separate chaining baja, sube y vuelve a bajar</w:t>
+      </w:r>
+    </w:p>
+    <w:p>
+      <w:pPr>
+        <w:pStyle w:val="Prrafodelista"/>
         <w:rPr>
           <w:lang w:val="es-419"/>
         </w:rPr>
@@ -2192,8 +2616,56 @@
     <w:p>
       <w:pPr>
         <w:pStyle w:val="Prrafodelista"/>
+        <w:ind w:left="360"/>
+        <w:jc w:val="both"/>
         <w:rPr>
           <w:lang w:val="es-419"/>
+        </w:rPr>
+      </w:pPr>
+    </w:p>
+    <w:p>
+      <w:pPr>
+        <w:pStyle w:val="Prrafodelista"/>
+        <w:ind w:left="360"/>
+        <w:jc w:val="both"/>
+        <w:rPr>
+          <w:lang w:val="es-CO"/>
+        </w:rPr>
+      </w:pPr>
+      <w:r>
+        <w:rPr>
+          <w:lang w:val="es-CO"/>
+        </w:rPr>
+        <w:t xml:space="preserve">Linear probing de 2 a 8 baja, </w:t>
+      </w:r>
+      <w:r>
+        <w:rPr>
+          <w:lang w:val="es-CO"/>
+        </w:rPr>
+        <w:t>al principio es grande la baja pero se va achicando</w:t>
+      </w:r>
+    </w:p>
+    <w:p>
+      <w:pPr>
+        <w:pStyle w:val="Prrafodelista"/>
+        <w:ind w:left="360"/>
+        <w:jc w:val="both"/>
+        <w:rPr>
+          <w:lang w:val="es-CO"/>
+        </w:rPr>
+      </w:pPr>
+      <w:r>
+        <w:rPr>
+          <w:lang w:val="es-CO"/>
+        </w:rPr>
+        <w:t>En separate chainig también hay una baja de 2  a 8, pero se vuelve más pequeña así como en linear probing</w:t>
+      </w:r>
+    </w:p>
+    <w:p>
+      <w:pPr>
+        <w:pStyle w:val="Prrafodelista"/>
+        <w:rPr>
+          <w:lang w:val="es-CO"/>
         </w:rPr>
       </w:pPr>
     </w:p>
@@ -2231,6 +2703,23 @@
     <w:p>
       <w:pPr>
         <w:pStyle w:val="Prrafodelista"/>
+        <w:ind w:left="360"/>
+        <w:jc w:val="both"/>
+        <w:rPr>
+          <w:lang w:val="es-419"/>
+        </w:rPr>
+      </w:pPr>
+      <w:r>
+        <w:rPr>
+          <w:lang w:val="es-419"/>
+        </w:rPr>
+        <w:lastRenderedPageBreak/>
+        <w:t>Al promediar las corridas vemos que separate chaining es más bajo pero por poco (promedio 5293 de separate vs 5704 de lineal probing)</w:t>
+      </w:r>
+    </w:p>
+    <w:p>
+      <w:pPr>
+        <w:pStyle w:val="Prrafodelista"/>
         <w:rPr>
           <w:lang w:val="es-419"/>
         </w:rPr>
@@ -2276,6 +2765,22 @@
           <w:lang w:val="es-419"/>
         </w:rPr>
       </w:pPr>
+    </w:p>
+    <w:p>
+      <w:pPr>
+        <w:pStyle w:val="Prrafodelista"/>
+        <w:ind w:left="360"/>
+        <w:jc w:val="both"/>
+        <w:rPr>
+          <w:lang w:val="es-419"/>
+        </w:rPr>
+      </w:pPr>
+      <w:r>
+        <w:rPr>
+          <w:lang w:val="es-419"/>
+        </w:rPr>
+        <w:t>Depende de cual sea el factor de carga, ya que si es bajo separate chaining es el que gasta menos. Si es alto son casi iguales.</w:t>
+      </w:r>
     </w:p>
     <w:sectPr>
       <w:pgSz w:w="12240" w:h="15840"/>
@@ -2288,7 +2793,7 @@
 </file>
 
 <file path=word/endnotes.xml><?xml version="1.0" encoding="utf-8"?>
-<w:endnotes xmlns:wpc="http://schemas.microsoft.com/office/word/2010/wordprocessingCanvas" xmlns:cx="http://schemas.microsoft.com/office/drawing/2014/chartex" xmlns:cx1="http://schemas.microsoft.com/office/drawing/2015/9/8/chartex" xmlns:cx2="http://schemas.microsoft.com/office/drawing/2015/10/21/chartex" xmlns:cx3="http://schemas.microsoft.com/office/drawing/2016/5/9/chartex" xmlns:cx4="http://schemas.microsoft.com/office/drawing/2016/5/10/chartex" xmlns:cx5="http://schemas.microsoft.com/office/drawing/2016/5/11/chartex" xmlns:cx6="http://schemas.microsoft.com/office/drawing/2016/5/12/chartex" xmlns:cx7="http://schemas.microsoft.com/office/drawing/2016/5/13/chartex" xmlns:cx8="http://schemas.microsoft.com/office/drawing/2016/5/14/chartex" xmlns:mc="http://schemas.openxmlformats.org/markup-compatibility/2006" xmlns:aink="http://schemas.microsoft.com/office/drawing/2016/ink" xmlns:am3d="http://schemas.microsoft.com/office/drawing/2017/model3d" xmlns:o="urn:schemas-microsoft-com:office:office" xmlns:oel="http://schemas.microsoft.com/office/2019/extlst" xmlns:r="http://schemas.openxmlformats.org/officeDocument/2006/relationships" xmlns:m="http://schemas.openxmlformats.org/officeDocument/2006/math" xmlns:v="urn:schemas-microsoft-com:vml" xmlns:wp14="http://schemas.microsoft.com/office/word/2010/wordprocessingDrawing" xmlns:wp="http://schemas.openxmlformats.org/drawingml/2006/wordprocessingDrawing" xmlns:w10="urn:schemas-microsoft-com:office:word" xmlns:w="http://schemas.openxmlformats.org/wordprocessingml/2006/main" xmlns:w14="http://schemas.microsoft.com/office/word/2010/wordml" xmlns:w15="http://schemas.microsoft.com/office/word/2012/wordml" xmlns:w16cex="http://schemas.microsoft.com/office/word/2018/wordml/cex" xmlns:w16cid="http://schemas.microsoft.com/office/word/2016/wordml/cid" xmlns:w16="http://schemas.microsoft.com/office/word/2018/wordml" xmlns:w16du="http://schemas.microsoft.com/office/word/2023/wordml/word16du" xmlns:w16sdtdh="http://schemas.microsoft.com/office/word/2020/wordml/sdtdatahash" xmlns:w16sdtfl="http://schemas.microsoft.com/office/word/2024/wordml/sdtformatlock" xmlns:w16se="http://schemas.microsoft.com/office/word/2015/wordml/symex" xmlns:wpg="http://schemas.microsoft.com/office/word/2010/wordprocessingGroup" xmlns:wpi="http://schemas.microsoft.com/office/word/2010/wordprocessingInk" xmlns:wne="http://schemas.microsoft.com/office/word/2006/wordml" xmlns:wps="http://schemas.microsoft.com/office/word/2010/wordprocessingShape" mc:Ignorable="w14 w15 w16se w16cid w16 w16cex w16sdtdh w16sdtfl w16du wp14">
+<w:endnotes xmlns:wpc="http://schemas.microsoft.com/office/word/2010/wordprocessingCanvas" xmlns:cx="http://schemas.microsoft.com/office/drawing/2014/chartex" xmlns:cx1="http://schemas.microsoft.com/office/drawing/2015/9/8/chartex" xmlns:cx2="http://schemas.microsoft.com/office/drawing/2015/10/21/chartex" xmlns:cx3="http://schemas.microsoft.com/office/drawing/2016/5/9/chartex" xmlns:cx4="http://schemas.microsoft.com/office/drawing/2016/5/10/chartex" xmlns:cx5="http://schemas.microsoft.com/office/drawing/2016/5/11/chartex" xmlns:cx6="http://schemas.microsoft.com/office/drawing/2016/5/12/chartex" xmlns:cx7="http://schemas.microsoft.com/office/drawing/2016/5/13/chartex" xmlns:cx8="http://schemas.microsoft.com/office/drawing/2016/5/14/chartex" xmlns:mc="http://schemas.openxmlformats.org/markup-compatibility/2006" xmlns:aink="http://schemas.microsoft.com/office/drawing/2016/ink" xmlns:am3d="http://schemas.microsoft.com/office/drawing/2017/model3d" xmlns:o="urn:schemas-microsoft-com:office:office" xmlns:r="http://schemas.openxmlformats.org/officeDocument/2006/relationships" xmlns:m="http://schemas.openxmlformats.org/officeDocument/2006/math" xmlns:v="urn:schemas-microsoft-com:vml" xmlns:wp14="http://schemas.microsoft.com/office/word/2010/wordprocessingDrawing" xmlns:wp="http://schemas.openxmlformats.org/drawingml/2006/wordprocessingDrawing" xmlns:w10="urn:schemas-microsoft-com:office:word" xmlns:w="http://schemas.openxmlformats.org/wordprocessingml/2006/main" xmlns:w14="http://schemas.microsoft.com/office/word/2010/wordml" xmlns:w15="http://schemas.microsoft.com/office/word/2012/wordml" xmlns:w16cex="http://schemas.microsoft.com/office/word/2018/wordml/cex" xmlns:w16cid="http://schemas.microsoft.com/office/word/2016/wordml/cid" xmlns:w16="http://schemas.microsoft.com/office/word/2018/wordml" xmlns:w16sdtdh="http://schemas.microsoft.com/office/word/2020/wordml/sdtdatahash" xmlns:w16se="http://schemas.microsoft.com/office/word/2015/wordml/symex" xmlns:wpg="http://schemas.microsoft.com/office/word/2010/wordprocessingGroup" xmlns:wpi="http://schemas.microsoft.com/office/word/2010/wordprocessingInk" xmlns:wne="http://schemas.microsoft.com/office/word/2006/wordml" xmlns:wps="http://schemas.microsoft.com/office/word/2010/wordprocessingShape" mc:Ignorable="w14 w15 w16se w16cid w16 w16cex w16sdtdh wp14">
   <w:endnote w:type="separator" w:id="-1">
     <w:p>
       <w:pPr>
@@ -2320,7 +2825,7 @@
 </file>
 
 <file path=word/footnotes.xml><?xml version="1.0" encoding="utf-8"?>
-<w:footnotes xmlns:wpc="http://schemas.microsoft.com/office/word/2010/wordprocessingCanvas" xmlns:cx="http://schemas.microsoft.com/office/drawing/2014/chartex" xmlns:cx1="http://schemas.microsoft.com/office/drawing/2015/9/8/chartex" xmlns:cx2="http://schemas.microsoft.com/office/drawing/2015/10/21/chartex" xmlns:cx3="http://schemas.microsoft.com/office/drawing/2016/5/9/chartex" xmlns:cx4="http://schemas.microsoft.com/office/drawing/2016/5/10/chartex" xmlns:cx5="http://schemas.microsoft.com/office/drawing/2016/5/11/chartex" xmlns:cx6="http://schemas.microsoft.com/office/drawing/2016/5/12/chartex" xmlns:cx7="http://schemas.microsoft.com/office/drawing/2016/5/13/chartex" xmlns:cx8="http://schemas.microsoft.com/office/drawing/2016/5/14/chartex" xmlns:mc="http://schemas.openxmlformats.org/markup-compatibility/2006" xmlns:aink="http://schemas.microsoft.com/office/drawing/2016/ink" xmlns:am3d="http://schemas.microsoft.com/office/drawing/2017/model3d" xmlns:o="urn:schemas-microsoft-com:office:office" xmlns:oel="http://schemas.microsoft.com/office/2019/extlst" xmlns:r="http://schemas.openxmlformats.org/officeDocument/2006/relationships" xmlns:m="http://schemas.openxmlformats.org/officeDocument/2006/math" xmlns:v="urn:schemas-microsoft-com:vml" xmlns:wp14="http://schemas.microsoft.com/office/word/2010/wordprocessingDrawing" xmlns:wp="http://schemas.openxmlformats.org/drawingml/2006/wordprocessingDrawing" xmlns:w10="urn:schemas-microsoft-com:office:word" xmlns:w="http://schemas.openxmlformats.org/wordprocessingml/2006/main" xmlns:w14="http://schemas.microsoft.com/office/word/2010/wordml" xmlns:w15="http://schemas.microsoft.com/office/word/2012/wordml" xmlns:w16cex="http://schemas.microsoft.com/office/word/2018/wordml/cex" xmlns:w16cid="http://schemas.microsoft.com/office/word/2016/wordml/cid" xmlns:w16="http://schemas.microsoft.com/office/word/2018/wordml" xmlns:w16du="http://schemas.microsoft.com/office/word/2023/wordml/word16du" xmlns:w16sdtdh="http://schemas.microsoft.com/office/word/2020/wordml/sdtdatahash" xmlns:w16sdtfl="http://schemas.microsoft.com/office/word/2024/wordml/sdtformatlock" xmlns:w16se="http://schemas.microsoft.com/office/word/2015/wordml/symex" xmlns:wpg="http://schemas.microsoft.com/office/word/2010/wordprocessingGroup" xmlns:wpi="http://schemas.microsoft.com/office/word/2010/wordprocessingInk" xmlns:wne="http://schemas.microsoft.com/office/word/2006/wordml" xmlns:wps="http://schemas.microsoft.com/office/word/2010/wordprocessingShape" mc:Ignorable="w14 w15 w16se w16cid w16 w16cex w16sdtdh w16sdtfl w16du wp14">
+<w:footnotes xmlns:wpc="http://schemas.microsoft.com/office/word/2010/wordprocessingCanvas" xmlns:cx="http://schemas.microsoft.com/office/drawing/2014/chartex" xmlns:cx1="http://schemas.microsoft.com/office/drawing/2015/9/8/chartex" xmlns:cx2="http://schemas.microsoft.com/office/drawing/2015/10/21/chartex" xmlns:cx3="http://schemas.microsoft.com/office/drawing/2016/5/9/chartex" xmlns:cx4="http://schemas.microsoft.com/office/drawing/2016/5/10/chartex" xmlns:cx5="http://schemas.microsoft.com/office/drawing/2016/5/11/chartex" xmlns:cx6="http://schemas.microsoft.com/office/drawing/2016/5/12/chartex" xmlns:cx7="http://schemas.microsoft.com/office/drawing/2016/5/13/chartex" xmlns:cx8="http://schemas.microsoft.com/office/drawing/2016/5/14/chartex" xmlns:mc="http://schemas.openxmlformats.org/markup-compatibility/2006" xmlns:aink="http://schemas.microsoft.com/office/drawing/2016/ink" xmlns:am3d="http://schemas.microsoft.com/office/drawing/2017/model3d" xmlns:o="urn:schemas-microsoft-com:office:office" xmlns:r="http://schemas.openxmlformats.org/officeDocument/2006/relationships" xmlns:m="http://schemas.openxmlformats.org/officeDocument/2006/math" xmlns:v="urn:schemas-microsoft-com:vml" xmlns:wp14="http://schemas.microsoft.com/office/word/2010/wordprocessingDrawing" xmlns:wp="http://schemas.openxmlformats.org/drawingml/2006/wordprocessingDrawing" xmlns:w10="urn:schemas-microsoft-com:office:word" xmlns:w="http://schemas.openxmlformats.org/wordprocessingml/2006/main" xmlns:w14="http://schemas.microsoft.com/office/word/2010/wordml" xmlns:w15="http://schemas.microsoft.com/office/word/2012/wordml" xmlns:w16cex="http://schemas.microsoft.com/office/word/2018/wordml/cex" xmlns:w16cid="http://schemas.microsoft.com/office/word/2016/wordml/cid" xmlns:w16="http://schemas.microsoft.com/office/word/2018/wordml" xmlns:w16sdtdh="http://schemas.microsoft.com/office/word/2020/wordml/sdtdatahash" xmlns:w16se="http://schemas.microsoft.com/office/word/2015/wordml/symex" xmlns:wpg="http://schemas.microsoft.com/office/word/2010/wordprocessingGroup" xmlns:wpi="http://schemas.microsoft.com/office/word/2010/wordprocessingInk" xmlns:wne="http://schemas.microsoft.com/office/word/2006/wordml" xmlns:wps="http://schemas.microsoft.com/office/word/2010/wordprocessingShape" mc:Ignorable="w14 w15 w16se w16cid w16 w16cex w16sdtdh wp14">
   <w:footnote w:type="separator" w:id="-1">
     <w:p>
       <w:pPr>
@@ -2352,7 +2857,7 @@
 </file>
 
 <file path=word/numbering.xml><?xml version="1.0" encoding="utf-8"?>
-<w:numbering xmlns:wpc="http://schemas.microsoft.com/office/word/2010/wordprocessingCanvas" xmlns:cx="http://schemas.microsoft.com/office/drawing/2014/chartex" xmlns:cx1="http://schemas.microsoft.com/office/drawing/2015/9/8/chartex" xmlns:cx2="http://schemas.microsoft.com/office/drawing/2015/10/21/chartex" xmlns:cx3="http://schemas.microsoft.com/office/drawing/2016/5/9/chartex" xmlns:cx4="http://schemas.microsoft.com/office/drawing/2016/5/10/chartex" xmlns:cx5="http://schemas.microsoft.com/office/drawing/2016/5/11/chartex" xmlns:cx6="http://schemas.microsoft.com/office/drawing/2016/5/12/chartex" xmlns:cx7="http://schemas.microsoft.com/office/drawing/2016/5/13/chartex" xmlns:cx8="http://schemas.microsoft.com/office/drawing/2016/5/14/chartex" xmlns:mc="http://schemas.openxmlformats.org/markup-compatibility/2006" xmlns:aink="http://schemas.microsoft.com/office/drawing/2016/ink" xmlns:am3d="http://schemas.microsoft.com/office/drawing/2017/model3d" xmlns:o="urn:schemas-microsoft-com:office:office" xmlns:oel="http://schemas.microsoft.com/office/2019/extlst" xmlns:r="http://schemas.openxmlformats.org/officeDocument/2006/relationships" xmlns:m="http://schemas.openxmlformats.org/officeDocument/2006/math" xmlns:v="urn:schemas-microsoft-com:vml" xmlns:wp14="http://schemas.microsoft.com/office/word/2010/wordprocessingDrawing" xmlns:wp="http://schemas.openxmlformats.org/drawingml/2006/wordprocessingDrawing" xmlns:w10="urn:schemas-microsoft-com:office:word" xmlns:w="http://schemas.openxmlformats.org/wordprocessingml/2006/main" xmlns:w14="http://schemas.microsoft.com/office/word/2010/wordml" xmlns:w15="http://schemas.microsoft.com/office/word/2012/wordml" xmlns:w16cex="http://schemas.microsoft.com/office/word/2018/wordml/cex" xmlns:w16cid="http://schemas.microsoft.com/office/word/2016/wordml/cid" xmlns:w16="http://schemas.microsoft.com/office/word/2018/wordml" xmlns:w16du="http://schemas.microsoft.com/office/word/2023/wordml/word16du" xmlns:w16sdtdh="http://schemas.microsoft.com/office/word/2020/wordml/sdtdatahash" xmlns:w16sdtfl="http://schemas.microsoft.com/office/word/2024/wordml/sdtformatlock" xmlns:w16se="http://schemas.microsoft.com/office/word/2015/wordml/symex" xmlns:wpg="http://schemas.microsoft.com/office/word/2010/wordprocessingGroup" xmlns:wpi="http://schemas.microsoft.com/office/word/2010/wordprocessingInk" xmlns:wne="http://schemas.microsoft.com/office/word/2006/wordml" xmlns:wps="http://schemas.microsoft.com/office/word/2010/wordprocessingShape" mc:Ignorable="w14 w15 w16se w16cid w16 w16cex w16sdtdh w16sdtfl w16du wp14">
+<w:numbering xmlns:wpc="http://schemas.microsoft.com/office/word/2010/wordprocessingCanvas" xmlns:cx="http://schemas.microsoft.com/office/drawing/2014/chartex" xmlns:cx1="http://schemas.microsoft.com/office/drawing/2015/9/8/chartex" xmlns:cx2="http://schemas.microsoft.com/office/drawing/2015/10/21/chartex" xmlns:cx3="http://schemas.microsoft.com/office/drawing/2016/5/9/chartex" xmlns:cx4="http://schemas.microsoft.com/office/drawing/2016/5/10/chartex" xmlns:cx5="http://schemas.microsoft.com/office/drawing/2016/5/11/chartex" xmlns:cx6="http://schemas.microsoft.com/office/drawing/2016/5/12/chartex" xmlns:cx7="http://schemas.microsoft.com/office/drawing/2016/5/13/chartex" xmlns:cx8="http://schemas.microsoft.com/office/drawing/2016/5/14/chartex" xmlns:mc="http://schemas.openxmlformats.org/markup-compatibility/2006" xmlns:aink="http://schemas.microsoft.com/office/drawing/2016/ink" xmlns:am3d="http://schemas.microsoft.com/office/drawing/2017/model3d" xmlns:o="urn:schemas-microsoft-com:office:office" xmlns:r="http://schemas.openxmlformats.org/officeDocument/2006/relationships" xmlns:m="http://schemas.openxmlformats.org/officeDocument/2006/math" xmlns:v="urn:schemas-microsoft-com:vml" xmlns:wp14="http://schemas.microsoft.com/office/word/2010/wordprocessingDrawing" xmlns:wp="http://schemas.openxmlformats.org/drawingml/2006/wordprocessingDrawing" xmlns:w10="urn:schemas-microsoft-com:office:word" xmlns:w="http://schemas.openxmlformats.org/wordprocessingml/2006/main" xmlns:w14="http://schemas.microsoft.com/office/word/2010/wordml" xmlns:w15="http://schemas.microsoft.com/office/word/2012/wordml" xmlns:w16cex="http://schemas.microsoft.com/office/word/2018/wordml/cex" xmlns:w16cid="http://schemas.microsoft.com/office/word/2016/wordml/cid" xmlns:w16="http://schemas.microsoft.com/office/word/2018/wordml" xmlns:w16sdtdh="http://schemas.microsoft.com/office/word/2020/wordml/sdtdatahash" xmlns:w16se="http://schemas.microsoft.com/office/word/2015/wordml/symex" xmlns:wpg="http://schemas.microsoft.com/office/word/2010/wordprocessingGroup" xmlns:wpi="http://schemas.microsoft.com/office/word/2010/wordprocessingInk" xmlns:wne="http://schemas.microsoft.com/office/word/2006/wordml" xmlns:wps="http://schemas.microsoft.com/office/word/2010/wordprocessingShape" mc:Ignorable="w14 w15 w16se w16cid w16 w16cex w16sdtdh wp14">
   <w:abstractNum w:abstractNumId="0" w15:restartNumberingAfterBreak="0">
     <w:nsid w:val="00F45053"/>
     <w:multiLevelType w:val="hybridMultilevel"/>
@@ -3722,53 +4227,53 @@
       </w:pPr>
     </w:lvl>
   </w:abstractNum>
-  <w:num w:numId="1" w16cid:durableId="929696733">
+  <w:num w:numId="1">
     <w:abstractNumId w:val="9"/>
   </w:num>
-  <w:num w:numId="2" w16cid:durableId="754136309">
+  <w:num w:numId="2">
     <w:abstractNumId w:val="1"/>
   </w:num>
-  <w:num w:numId="3" w16cid:durableId="1987083975">
+  <w:num w:numId="3">
     <w:abstractNumId w:val="10"/>
   </w:num>
-  <w:num w:numId="4" w16cid:durableId="976683378">
+  <w:num w:numId="4">
     <w:abstractNumId w:val="12"/>
   </w:num>
-  <w:num w:numId="5" w16cid:durableId="2068407280">
+  <w:num w:numId="5">
     <w:abstractNumId w:val="13"/>
   </w:num>
-  <w:num w:numId="6" w16cid:durableId="1928689656">
+  <w:num w:numId="6">
     <w:abstractNumId w:val="0"/>
   </w:num>
-  <w:num w:numId="7" w16cid:durableId="1109198423">
+  <w:num w:numId="7">
     <w:abstractNumId w:val="6"/>
   </w:num>
-  <w:num w:numId="8" w16cid:durableId="134957518">
+  <w:num w:numId="8">
     <w:abstractNumId w:val="11"/>
   </w:num>
-  <w:num w:numId="9" w16cid:durableId="912084821">
+  <w:num w:numId="9">
     <w:abstractNumId w:val="2"/>
   </w:num>
-  <w:num w:numId="10" w16cid:durableId="1880630713">
+  <w:num w:numId="10">
     <w:abstractNumId w:val="4"/>
   </w:num>
-  <w:num w:numId="11" w16cid:durableId="2108694880">
+  <w:num w:numId="11">
     <w:abstractNumId w:val="7"/>
   </w:num>
-  <w:num w:numId="12" w16cid:durableId="1417705283">
+  <w:num w:numId="12">
     <w:abstractNumId w:val="3"/>
   </w:num>
-  <w:num w:numId="13" w16cid:durableId="162357855">
+  <w:num w:numId="13">
     <w:abstractNumId w:val="8"/>
   </w:num>
-  <w:num w:numId="14" w16cid:durableId="838273731">
+  <w:num w:numId="14">
     <w:abstractNumId w:val="5"/>
   </w:num>
 </w:numbering>
 </file>
 
 <file path=word/styles.xml><?xml version="1.0" encoding="utf-8"?>
-<w:styles xmlns:mc="http://schemas.openxmlformats.org/markup-compatibility/2006" xmlns:r="http://schemas.openxmlformats.org/officeDocument/2006/relationships" xmlns:w="http://schemas.openxmlformats.org/wordprocessingml/2006/main" xmlns:w14="http://schemas.microsoft.com/office/word/2010/wordml" xmlns:w15="http://schemas.microsoft.com/office/word/2012/wordml" xmlns:w16cex="http://schemas.microsoft.com/office/word/2018/wordml/cex" xmlns:w16cid="http://schemas.microsoft.com/office/word/2016/wordml/cid" xmlns:w16="http://schemas.microsoft.com/office/word/2018/wordml" xmlns:w16du="http://schemas.microsoft.com/office/word/2023/wordml/word16du" xmlns:w16sdtdh="http://schemas.microsoft.com/office/word/2020/wordml/sdtdatahash" xmlns:w16sdtfl="http://schemas.microsoft.com/office/word/2024/wordml/sdtformatlock" xmlns:w16se="http://schemas.microsoft.com/office/word/2015/wordml/symex" mc:Ignorable="w14 w15 w16se w16cid w16 w16cex w16sdtdh w16sdtfl w16du">
+<w:styles xmlns:mc="http://schemas.openxmlformats.org/markup-compatibility/2006" xmlns:r="http://schemas.openxmlformats.org/officeDocument/2006/relationships" xmlns:w="http://schemas.openxmlformats.org/wordprocessingml/2006/main" xmlns:w14="http://schemas.microsoft.com/office/word/2010/wordml" xmlns:w15="http://schemas.microsoft.com/office/word/2012/wordml" xmlns:w16cex="http://schemas.microsoft.com/office/word/2018/wordml/cex" xmlns:w16cid="http://schemas.microsoft.com/office/word/2016/wordml/cid" xmlns:w16="http://schemas.microsoft.com/office/word/2018/wordml" xmlns:w16sdtdh="http://schemas.microsoft.com/office/word/2020/wordml/sdtdatahash" xmlns:w16se="http://schemas.microsoft.com/office/word/2015/wordml/symex" mc:Ignorable="w14 w15 w16se w16cid w16 w16cex w16sdtdh">
   <w:docDefaults>
     <w:rPrDefault>
       <w:rPr>
@@ -4802,6 +5307,26 @@
 </file>
 
 <file path=customXml/item1.xml><?xml version="1.0" encoding="utf-8"?>
+<p:properties xmlns:p="http://schemas.microsoft.com/office/2006/metadata/properties" xmlns:xsi="http://www.w3.org/2001/XMLSchema-instance" xmlns:pc="http://schemas.microsoft.com/office/infopath/2007/PartnerControls">
+  <documentManagement>
+    <TaxCatchAll xmlns="85e30bcc-d76c-4413-8e4d-2dce22fb0743" xsi:nil="true"/>
+    <lcf76f155ced4ddcb4097134ff3c332f xmlns="164883f8-7691-4ecf-b54a-664c0d0edefe">
+      <Terms xmlns="http://schemas.microsoft.com/office/infopath/2007/PartnerControls"/>
+    </lcf76f155ced4ddcb4097134ff3c332f>
+  </documentManagement>
+</p:properties>
+</file>
+
+<file path=customXml/item2.xml><?xml version="1.0" encoding="utf-8"?>
+<?mso-contentType ?>
+<FormTemplates xmlns="http://schemas.microsoft.com/sharepoint/v3/contenttype/forms">
+  <Display>DocumentLibraryForm</Display>
+  <Edit>DocumentLibraryForm</Edit>
+  <New>DocumentLibraryForm</New>
+</FormTemplates>
+</file>
+
+<file path=customXml/item3.xml><?xml version="1.0" encoding="utf-8"?>
 <ct:contentTypeSchema xmlns:ct="http://schemas.microsoft.com/office/2006/metadata/contentType" xmlns:ma="http://schemas.microsoft.com/office/2006/metadata/properties/metaAttributes" ct:_="" ma:_="" ma:contentTypeName="Documento" ma:contentTypeID="0x01010023858CF01A2EF24688B692775F4C60A4" ma:contentTypeVersion="17" ma:contentTypeDescription="Crear nuevo documento." ma:contentTypeScope="" ma:versionID="af74a0f8eb440a60883e9dd833f0742f">
   <xsd:schema xmlns:xsd="http://www.w3.org/2001/XMLSchema" xmlns:xs="http://www.w3.org/2001/XMLSchema" xmlns:p="http://schemas.microsoft.com/office/2006/metadata/properties" xmlns:ns2="164883f8-7691-4ecf-b54a-664c0d0edefe" xmlns:ns3="85e30bcc-d76c-4413-8e4d-2dce22fb0743" targetNamespace="http://schemas.microsoft.com/office/2006/metadata/properties" ma:root="true" ma:fieldsID="f5ceeff32ffca1089660572a8ebd1782" ns2:_="" ns3:_="">
     <xsd:import namespace="164883f8-7691-4ecf-b54a-664c0d0edefe"/>
@@ -5050,27 +5575,26 @@
 </ct:contentTypeSchema>
 </file>
 
-<file path=customXml/item2.xml><?xml version="1.0" encoding="utf-8"?>
-<?mso-contentType ?>
-<FormTemplates xmlns="http://schemas.microsoft.com/sharepoint/v3/contenttype/forms">
-  <Display>DocumentLibraryForm</Display>
-  <Edit>DocumentLibraryForm</Edit>
-  <New>DocumentLibraryForm</New>
-</FormTemplates>
+<file path=customXml/itemProps1.xml><?xml version="1.0" encoding="utf-8"?>
+<ds:datastoreItem xmlns:ds="http://schemas.openxmlformats.org/officeDocument/2006/customXml" ds:itemID="{8542EACB-7939-45C8-99C3-B6897CA7A7EF}">
+  <ds:schemaRefs>
+    <ds:schemaRef ds:uri="http://schemas.microsoft.com/office/2006/metadata/properties"/>
+    <ds:schemaRef ds:uri="http://schemas.microsoft.com/office/infopath/2007/PartnerControls"/>
+    <ds:schemaRef ds:uri="85e30bcc-d76c-4413-8e4d-2dce22fb0743"/>
+    <ds:schemaRef ds:uri="164883f8-7691-4ecf-b54a-664c0d0edefe"/>
+  </ds:schemaRefs>
+</ds:datastoreItem>
 </file>
 
-<file path=customXml/item3.xml><?xml version="1.0" encoding="utf-8"?>
-<p:properties xmlns:p="http://schemas.microsoft.com/office/2006/metadata/properties" xmlns:xsi="http://www.w3.org/2001/XMLSchema-instance" xmlns:pc="http://schemas.microsoft.com/office/infopath/2007/PartnerControls">
-  <documentManagement>
-    <TaxCatchAll xmlns="85e30bcc-d76c-4413-8e4d-2dce22fb0743" xsi:nil="true"/>
-    <lcf76f155ced4ddcb4097134ff3c332f xmlns="164883f8-7691-4ecf-b54a-664c0d0edefe">
-      <Terms xmlns="http://schemas.microsoft.com/office/infopath/2007/PartnerControls"/>
-    </lcf76f155ced4ddcb4097134ff3c332f>
-  </documentManagement>
-</p:properties>
+<file path=customXml/itemProps2.xml><?xml version="1.0" encoding="utf-8"?>
+<ds:datastoreItem xmlns:ds="http://schemas.openxmlformats.org/officeDocument/2006/customXml" ds:itemID="{1F59EA8B-1FA8-40D2-A8B0-61B9CE1E4579}">
+  <ds:schemaRefs>
+    <ds:schemaRef ds:uri="http://schemas.microsoft.com/sharepoint/v3/contenttype/forms"/>
+  </ds:schemaRefs>
+</ds:datastoreItem>
 </file>
 
-<file path=customXml/itemProps1.xml><?xml version="1.0" encoding="utf-8"?>
+<file path=customXml/itemProps3.xml><?xml version="1.0" encoding="utf-8"?>
 <ds:datastoreItem xmlns:ds="http://schemas.openxmlformats.org/officeDocument/2006/customXml" ds:itemID="{3D061157-43BE-4FE1-9C39-AC4CA83D3705}">
   <ds:schemaRefs>
     <ds:schemaRef ds:uri="http://schemas.microsoft.com/office/2006/metadata/contentType"/>
@@ -5087,23 +5611,4 @@
     <ds:schemaRef ds:uri="http://schemas.microsoft.com/internal/obd"/>
   </ds:schemaRefs>
 </ds:datastoreItem>
-</file>
-
-<file path=customXml/itemProps2.xml><?xml version="1.0" encoding="utf-8"?>
-<ds:datastoreItem xmlns:ds="http://schemas.openxmlformats.org/officeDocument/2006/customXml" ds:itemID="{1F59EA8B-1FA8-40D2-A8B0-61B9CE1E4579}">
-  <ds:schemaRefs>
-    <ds:schemaRef ds:uri="http://schemas.microsoft.com/sharepoint/v3/contenttype/forms"/>
-  </ds:schemaRefs>
-</ds:datastoreItem>
-</file>
-
-<file path=customXml/itemProps3.xml><?xml version="1.0" encoding="utf-8"?>
-<ds:datastoreItem xmlns:ds="http://schemas.openxmlformats.org/officeDocument/2006/customXml" ds:itemID="{8542EACB-7939-45C8-99C3-B6897CA7A7EF}">
-  <ds:schemaRefs>
-    <ds:schemaRef ds:uri="http://schemas.microsoft.com/office/2006/metadata/properties"/>
-    <ds:schemaRef ds:uri="http://schemas.microsoft.com/office/infopath/2007/PartnerControls"/>
-    <ds:schemaRef ds:uri="85e30bcc-d76c-4413-8e4d-2dce22fb0743"/>
-    <ds:schemaRef ds:uri="164883f8-7691-4ecf-b54a-664c0d0edefe"/>
-  </ds:schemaRefs>
-</ds:datastoreItem>
 </file>
</xml_diff>